<commit_message>
Finish case study chapters
</commit_message>
<xml_diff>
--- a/mitterpach_bp_en.docx
+++ b/mitterpach_bp_en.docx
@@ -632,7 +632,7 @@
             </w:rPr>
             <w:fldChar w:fldCharType="separate"/>
           </w:r>
-          <w:hyperlink w:anchor="_Toc224309138" w:history="1">
+          <w:hyperlink w:anchor="_Toc224314082" w:history="1">
             <w:r>
               <w:rPr>
                 <w:rStyle w:val="Hypertextovodkaz"/>
@@ -659,7 +659,7 @@
                 <w:noProof/>
                 <w:webHidden/>
               </w:rPr>
-              <w:instrText xml:space="preserve"> PAGEREF _Toc224309138 \h </w:instrText>
+              <w:instrText xml:space="preserve"> PAGEREF _Toc224314082 \h </w:instrText>
             </w:r>
             <w:r>
               <w:rPr>
@@ -707,7 +707,7 @@
               <w14:numForm w14:val="default"/>
             </w:rPr>
           </w:pPr>
-          <w:hyperlink w:anchor="_Toc224309139" w:history="1">
+          <w:hyperlink w:anchor="_Toc224314083" w:history="1">
             <w:r>
               <w:rPr>
                 <w:rStyle w:val="Hypertextovodkaz"/>
@@ -734,7 +734,7 @@
                 <w:noProof/>
                 <w:webHidden/>
               </w:rPr>
-              <w:instrText xml:space="preserve"> PAGEREF _Toc224309139 \h </w:instrText>
+              <w:instrText xml:space="preserve"> PAGEREF _Toc224314083 \h </w:instrText>
             </w:r>
             <w:r>
               <w:rPr>
@@ -782,7 +782,7 @@
               <w14:numForm w14:val="default"/>
             </w:rPr>
           </w:pPr>
-          <w:hyperlink w:anchor="_Toc224309140" w:history="1">
+          <w:hyperlink w:anchor="_Toc224314084" w:history="1">
             <w:r>
               <w:rPr>
                 <w:rStyle w:val="Hypertextovodkaz"/>
@@ -809,7 +809,7 @@
                 <w:noProof/>
                 <w:webHidden/>
               </w:rPr>
-              <w:instrText xml:space="preserve"> PAGEREF _Toc224309140 \h </w:instrText>
+              <w:instrText xml:space="preserve"> PAGEREF _Toc224314084 \h </w:instrText>
             </w:r>
             <w:r>
               <w:rPr>
@@ -857,7 +857,7 @@
               <w14:numForm w14:val="default"/>
             </w:rPr>
           </w:pPr>
-          <w:hyperlink w:anchor="_Toc224309141" w:history="1">
+          <w:hyperlink w:anchor="_Toc224314085" w:history="1">
             <w:r>
               <w:rPr>
                 <w:rStyle w:val="Hypertextovodkaz"/>
@@ -884,7 +884,7 @@
                 <w:noProof/>
                 <w:webHidden/>
               </w:rPr>
-              <w:instrText xml:space="preserve"> PAGEREF _Toc224309141 \h </w:instrText>
+              <w:instrText xml:space="preserve"> PAGEREF _Toc224314085 \h </w:instrText>
             </w:r>
             <w:r>
               <w:rPr>
@@ -932,7 +932,7 @@
               <w14:numForm w14:val="default"/>
             </w:rPr>
           </w:pPr>
-          <w:hyperlink w:anchor="_Toc224309142" w:history="1">
+          <w:hyperlink w:anchor="_Toc224314086" w:history="1">
             <w:r>
               <w:rPr>
                 <w:rStyle w:val="Hypertextovodkaz"/>
@@ -959,7 +959,7 @@
                 <w:noProof/>
                 <w:webHidden/>
               </w:rPr>
-              <w:instrText xml:space="preserve"> PAGEREF _Toc224309142 \h </w:instrText>
+              <w:instrText xml:space="preserve"> PAGEREF _Toc224314086 \h </w:instrText>
             </w:r>
             <w:r>
               <w:rPr>
@@ -1007,7 +1007,7 @@
               <w14:numForm w14:val="default"/>
             </w:rPr>
           </w:pPr>
-          <w:hyperlink w:anchor="_Toc224309143" w:history="1">
+          <w:hyperlink w:anchor="_Toc224314087" w:history="1">
             <w:r>
               <w:rPr>
                 <w:rStyle w:val="Hypertextovodkaz"/>
@@ -1034,7 +1034,7 @@
                 <w:noProof/>
                 <w:webHidden/>
               </w:rPr>
-              <w:instrText xml:space="preserve"> PAGEREF _Toc224309143 \h </w:instrText>
+              <w:instrText xml:space="preserve"> PAGEREF _Toc224314087 \h </w:instrText>
             </w:r>
             <w:r>
               <w:rPr>
@@ -1082,14 +1082,13 @@
               <w14:numForm w14:val="default"/>
             </w:rPr>
           </w:pPr>
-          <w:hyperlink w:anchor="_Toc224309144" w:history="1">
+          <w:hyperlink w:anchor="_Toc224314088" w:history="1">
             <w:r>
               <w:rPr>
                 <w:rStyle w:val="Hypertextovodkaz"/>
                 <w:noProof/>
-                <w:highlight w:val="yellow"/>
-              </w:rPr>
-              <w:t>1.3.1 Knight Capital implosion</w:t>
+              </w:rPr>
+              <w:t>1.3.1 Knight Capital</w:t>
             </w:r>
             <w:r>
               <w:rPr>
@@ -1110,7 +1109,7 @@
                 <w:noProof/>
                 <w:webHidden/>
               </w:rPr>
-              <w:instrText xml:space="preserve"> PAGEREF _Toc224309144 \h </w:instrText>
+              <w:instrText xml:space="preserve"> PAGEREF _Toc224314088 \h </w:instrText>
             </w:r>
             <w:r>
               <w:rPr>
@@ -1158,7 +1157,7 @@
               <w14:numForm w14:val="default"/>
             </w:rPr>
           </w:pPr>
-          <w:hyperlink w:anchor="_Toc224309145" w:history="1">
+          <w:hyperlink w:anchor="_Toc224314089" w:history="1">
             <w:r>
               <w:rPr>
                 <w:rStyle w:val="Hypertextovodkaz"/>
@@ -1186,7 +1185,7 @@
                 <w:noProof/>
                 <w:webHidden/>
               </w:rPr>
-              <w:instrText xml:space="preserve"> PAGEREF _Toc224309145 \h </w:instrText>
+              <w:instrText xml:space="preserve"> PAGEREF _Toc224314089 \h </w:instrText>
             </w:r>
             <w:r>
               <w:rPr>
@@ -1206,7 +1205,7 @@
                 <w:noProof/>
                 <w:webHidden/>
               </w:rPr>
-              <w:t>11</w:t>
+              <w:t>12</w:t>
             </w:r>
             <w:r>
               <w:rPr>
@@ -1234,7 +1233,7 @@
               <w14:numForm w14:val="default"/>
             </w:rPr>
           </w:pPr>
-          <w:hyperlink w:anchor="_Toc224309146" w:history="1">
+          <w:hyperlink w:anchor="_Toc224314090" w:history="1">
             <w:r>
               <w:rPr>
                 <w:rStyle w:val="Hypertextovodkaz"/>
@@ -1261,7 +1260,7 @@
                 <w:noProof/>
                 <w:webHidden/>
               </w:rPr>
-              <w:instrText xml:space="preserve"> PAGEREF _Toc224309146 \h </w:instrText>
+              <w:instrText xml:space="preserve"> PAGEREF _Toc224314090 \h </w:instrText>
             </w:r>
             <w:r>
               <w:rPr>
@@ -1281,7 +1280,7 @@
                 <w:noProof/>
                 <w:webHidden/>
               </w:rPr>
-              <w:t>12</w:t>
+              <w:t>13</w:t>
             </w:r>
             <w:r>
               <w:rPr>
@@ -1309,7 +1308,7 @@
               <w14:numForm w14:val="default"/>
             </w:rPr>
           </w:pPr>
-          <w:hyperlink w:anchor="_Toc224309147" w:history="1">
+          <w:hyperlink w:anchor="_Toc224314091" w:history="1">
             <w:r>
               <w:rPr>
                 <w:rStyle w:val="Hypertextovodkaz"/>
@@ -1336,7 +1335,7 @@
                 <w:noProof/>
                 <w:webHidden/>
               </w:rPr>
-              <w:instrText xml:space="preserve"> PAGEREF _Toc224309147 \h </w:instrText>
+              <w:instrText xml:space="preserve"> PAGEREF _Toc224314091 \h </w:instrText>
             </w:r>
             <w:r>
               <w:rPr>
@@ -1356,7 +1355,7 @@
                 <w:noProof/>
                 <w:webHidden/>
               </w:rPr>
-              <w:t>12</w:t>
+              <w:t>13</w:t>
             </w:r>
             <w:r>
               <w:rPr>
@@ -1384,7 +1383,7 @@
               <w14:numForm w14:val="default"/>
             </w:rPr>
           </w:pPr>
-          <w:hyperlink w:anchor="_Toc224309148" w:history="1">
+          <w:hyperlink w:anchor="_Toc224314092" w:history="1">
             <w:r>
               <w:rPr>
                 <w:rStyle w:val="Hypertextovodkaz"/>
@@ -1411,7 +1410,7 @@
                 <w:noProof/>
                 <w:webHidden/>
               </w:rPr>
-              <w:instrText xml:space="preserve"> PAGEREF _Toc224309148 \h </w:instrText>
+              <w:instrText xml:space="preserve"> PAGEREF _Toc224314092 \h </w:instrText>
             </w:r>
             <w:r>
               <w:rPr>
@@ -1431,7 +1430,7 @@
                 <w:noProof/>
                 <w:webHidden/>
               </w:rPr>
-              <w:t>12</w:t>
+              <w:t>13</w:t>
             </w:r>
             <w:r>
               <w:rPr>
@@ -1459,7 +1458,7 @@
               <w14:numForm w14:val="default"/>
             </w:rPr>
           </w:pPr>
-          <w:hyperlink w:anchor="_Toc224309149" w:history="1">
+          <w:hyperlink w:anchor="_Toc224314093" w:history="1">
             <w:r>
               <w:rPr>
                 <w:rStyle w:val="Hypertextovodkaz"/>
@@ -1486,7 +1485,7 @@
                 <w:noProof/>
                 <w:webHidden/>
               </w:rPr>
-              <w:instrText xml:space="preserve"> PAGEREF _Toc224309149 \h </w:instrText>
+              <w:instrText xml:space="preserve"> PAGEREF _Toc224314093 \h </w:instrText>
             </w:r>
             <w:r>
               <w:rPr>
@@ -1506,7 +1505,7 @@
                 <w:noProof/>
                 <w:webHidden/>
               </w:rPr>
-              <w:t>12</w:t>
+              <w:t>13</w:t>
             </w:r>
             <w:r>
               <w:rPr>
@@ -1534,7 +1533,7 @@
               <w14:numForm w14:val="default"/>
             </w:rPr>
           </w:pPr>
-          <w:hyperlink w:anchor="_Toc224309150" w:history="1">
+          <w:hyperlink w:anchor="_Toc224314094" w:history="1">
             <w:r>
               <w:rPr>
                 <w:rStyle w:val="Hypertextovodkaz"/>
@@ -1561,7 +1560,7 @@
                 <w:noProof/>
                 <w:webHidden/>
               </w:rPr>
-              <w:instrText xml:space="preserve"> PAGEREF _Toc224309150 \h </w:instrText>
+              <w:instrText xml:space="preserve"> PAGEREF _Toc224314094 \h </w:instrText>
             </w:r>
             <w:r>
               <w:rPr>
@@ -1581,7 +1580,7 @@
                 <w:noProof/>
                 <w:webHidden/>
               </w:rPr>
-              <w:t>12</w:t>
+              <w:t>13</w:t>
             </w:r>
             <w:r>
               <w:rPr>
@@ -1609,7 +1608,7 @@
               <w14:numForm w14:val="default"/>
             </w:rPr>
           </w:pPr>
-          <w:hyperlink w:anchor="_Toc224309151" w:history="1">
+          <w:hyperlink w:anchor="_Toc224314095" w:history="1">
             <w:r>
               <w:rPr>
                 <w:rStyle w:val="Hypertextovodkaz"/>
@@ -1636,7 +1635,7 @@
                 <w:noProof/>
                 <w:webHidden/>
               </w:rPr>
-              <w:instrText xml:space="preserve"> PAGEREF _Toc224309151 \h </w:instrText>
+              <w:instrText xml:space="preserve"> PAGEREF _Toc224314095 \h </w:instrText>
             </w:r>
             <w:r>
               <w:rPr>
@@ -1656,7 +1655,7 @@
                 <w:noProof/>
                 <w:webHidden/>
               </w:rPr>
-              <w:t>12</w:t>
+              <w:t>13</w:t>
             </w:r>
             <w:r>
               <w:rPr>
@@ -1684,7 +1683,7 @@
               <w14:numForm w14:val="default"/>
             </w:rPr>
           </w:pPr>
-          <w:hyperlink w:anchor="_Toc224309152" w:history="1">
+          <w:hyperlink w:anchor="_Toc224314096" w:history="1">
             <w:r>
               <w:rPr>
                 <w:rStyle w:val="Hypertextovodkaz"/>
@@ -1711,7 +1710,7 @@
                 <w:noProof/>
                 <w:webHidden/>
               </w:rPr>
-              <w:instrText xml:space="preserve"> PAGEREF _Toc224309152 \h </w:instrText>
+              <w:instrText xml:space="preserve"> PAGEREF _Toc224314096 \h </w:instrText>
             </w:r>
             <w:r>
               <w:rPr>
@@ -1731,7 +1730,7 @@
                 <w:noProof/>
                 <w:webHidden/>
               </w:rPr>
-              <w:t>12</w:t>
+              <w:t>13</w:t>
             </w:r>
             <w:r>
               <w:rPr>
@@ -1759,7 +1758,7 @@
               <w14:numForm w14:val="default"/>
             </w:rPr>
           </w:pPr>
-          <w:hyperlink w:anchor="_Toc224309153" w:history="1">
+          <w:hyperlink w:anchor="_Toc224314097" w:history="1">
             <w:r>
               <w:rPr>
                 <w:rStyle w:val="Hypertextovodkaz"/>
@@ -1786,7 +1785,7 @@
                 <w:noProof/>
                 <w:webHidden/>
               </w:rPr>
-              <w:instrText xml:space="preserve"> PAGEREF _Toc224309153 \h </w:instrText>
+              <w:instrText xml:space="preserve"> PAGEREF _Toc224314097 \h </w:instrText>
             </w:r>
             <w:r>
               <w:rPr>
@@ -1806,7 +1805,7 @@
                 <w:noProof/>
                 <w:webHidden/>
               </w:rPr>
-              <w:t>13</w:t>
+              <w:t>14</w:t>
             </w:r>
             <w:r>
               <w:rPr>
@@ -1834,7 +1833,7 @@
               <w14:numForm w14:val="default"/>
             </w:rPr>
           </w:pPr>
-          <w:hyperlink w:anchor="_Toc224309154" w:history="1">
+          <w:hyperlink w:anchor="_Toc224314098" w:history="1">
             <w:r>
               <w:rPr>
                 <w:rStyle w:val="Hypertextovodkaz"/>
@@ -1861,7 +1860,7 @@
                 <w:noProof/>
                 <w:webHidden/>
               </w:rPr>
-              <w:instrText xml:space="preserve"> PAGEREF _Toc224309154 \h </w:instrText>
+              <w:instrText xml:space="preserve"> PAGEREF _Toc224314098 \h </w:instrText>
             </w:r>
             <w:r>
               <w:rPr>
@@ -1881,7 +1880,7 @@
                 <w:noProof/>
                 <w:webHidden/>
               </w:rPr>
-              <w:t>14</w:t>
+              <w:t>15</w:t>
             </w:r>
             <w:r>
               <w:rPr>
@@ -1909,7 +1908,7 @@
               <w14:numForm w14:val="default"/>
             </w:rPr>
           </w:pPr>
-          <w:hyperlink w:anchor="_Toc224309155" w:history="1">
+          <w:hyperlink w:anchor="_Toc224314099" w:history="1">
             <w:r>
               <w:rPr>
                 <w:rStyle w:val="Hypertextovodkaz"/>
@@ -1936,7 +1935,7 @@
                 <w:noProof/>
                 <w:webHidden/>
               </w:rPr>
-              <w:instrText xml:space="preserve"> PAGEREF _Toc224309155 \h </w:instrText>
+              <w:instrText xml:space="preserve"> PAGEREF _Toc224314099 \h </w:instrText>
             </w:r>
             <w:r>
               <w:rPr>
@@ -1956,7 +1955,7 @@
                 <w:noProof/>
                 <w:webHidden/>
               </w:rPr>
-              <w:t>14</w:t>
+              <w:t>15</w:t>
             </w:r>
             <w:r>
               <w:rPr>
@@ -1984,7 +1983,7 @@
               <w14:numForm w14:val="default"/>
             </w:rPr>
           </w:pPr>
-          <w:hyperlink w:anchor="_Toc224309156" w:history="1">
+          <w:hyperlink w:anchor="_Toc224314100" w:history="1">
             <w:r>
               <w:rPr>
                 <w:rStyle w:val="Hypertextovodkaz"/>
@@ -2011,7 +2010,7 @@
                 <w:noProof/>
                 <w:webHidden/>
               </w:rPr>
-              <w:instrText xml:space="preserve"> PAGEREF _Toc224309156 \h </w:instrText>
+              <w:instrText xml:space="preserve"> PAGEREF _Toc224314100 \h </w:instrText>
             </w:r>
             <w:r>
               <w:rPr>
@@ -2031,7 +2030,7 @@
                 <w:noProof/>
                 <w:webHidden/>
               </w:rPr>
-              <w:t>15</w:t>
+              <w:t>16</w:t>
             </w:r>
             <w:r>
               <w:rPr>
@@ -2059,7 +2058,7 @@
               <w14:numForm w14:val="default"/>
             </w:rPr>
           </w:pPr>
-          <w:hyperlink w:anchor="_Toc224309157" w:history="1">
+          <w:hyperlink w:anchor="_Toc224314101" w:history="1">
             <w:r>
               <w:rPr>
                 <w:rStyle w:val="Hypertextovodkaz"/>
@@ -2086,7 +2085,7 @@
                 <w:noProof/>
                 <w:webHidden/>
               </w:rPr>
-              <w:instrText xml:space="preserve"> PAGEREF _Toc224309157 \h </w:instrText>
+              <w:instrText xml:space="preserve"> PAGEREF _Toc224314101 \h </w:instrText>
             </w:r>
             <w:r>
               <w:rPr>
@@ -2106,7 +2105,7 @@
                 <w:noProof/>
                 <w:webHidden/>
               </w:rPr>
-              <w:t>17</w:t>
+              <w:t>18</w:t>
             </w:r>
             <w:r>
               <w:rPr>
@@ -2134,7 +2133,7 @@
               <w14:numForm w14:val="default"/>
             </w:rPr>
           </w:pPr>
-          <w:hyperlink w:anchor="_Toc224309158" w:history="1">
+          <w:hyperlink w:anchor="_Toc224314102" w:history="1">
             <w:r>
               <w:rPr>
                 <w:rStyle w:val="Hypertextovodkaz"/>
@@ -2162,7 +2161,7 @@
                 <w:noProof/>
                 <w:webHidden/>
               </w:rPr>
-              <w:instrText xml:space="preserve"> PAGEREF _Toc224309158 \h </w:instrText>
+              <w:instrText xml:space="preserve"> PAGEREF _Toc224314102 \h </w:instrText>
             </w:r>
             <w:r>
               <w:rPr>
@@ -2182,7 +2181,7 @@
                 <w:noProof/>
                 <w:webHidden/>
               </w:rPr>
-              <w:t>20</w:t>
+              <w:t>21</w:t>
             </w:r>
             <w:r>
               <w:rPr>
@@ -2210,7 +2209,7 @@
               <w14:numForm w14:val="default"/>
             </w:rPr>
           </w:pPr>
-          <w:hyperlink w:anchor="_Toc224309159" w:history="1">
+          <w:hyperlink w:anchor="_Toc224314103" w:history="1">
             <w:r>
               <w:rPr>
                 <w:rStyle w:val="Hypertextovodkaz"/>
@@ -2237,7 +2236,7 @@
                 <w:noProof/>
                 <w:webHidden/>
               </w:rPr>
-              <w:instrText xml:space="preserve"> PAGEREF _Toc224309159 \h </w:instrText>
+              <w:instrText xml:space="preserve"> PAGEREF _Toc224314103 \h </w:instrText>
             </w:r>
             <w:r>
               <w:rPr>
@@ -2257,7 +2256,7 @@
                 <w:noProof/>
                 <w:webHidden/>
               </w:rPr>
-              <w:t>20</w:t>
+              <w:t>21</w:t>
             </w:r>
             <w:r>
               <w:rPr>
@@ -2285,7 +2284,7 @@
               <w14:numForm w14:val="default"/>
             </w:rPr>
           </w:pPr>
-          <w:hyperlink w:anchor="_Toc224309160" w:history="1">
+          <w:hyperlink w:anchor="_Toc224314104" w:history="1">
             <w:r>
               <w:rPr>
                 <w:rStyle w:val="Hypertextovodkaz"/>
@@ -2312,7 +2311,7 @@
                 <w:noProof/>
                 <w:webHidden/>
               </w:rPr>
-              <w:instrText xml:space="preserve"> PAGEREF _Toc224309160 \h </w:instrText>
+              <w:instrText xml:space="preserve"> PAGEREF _Toc224314104 \h </w:instrText>
             </w:r>
             <w:r>
               <w:rPr>
@@ -2332,7 +2331,7 @@
                 <w:noProof/>
                 <w:webHidden/>
               </w:rPr>
-              <w:t>22</w:t>
+              <w:t>23</w:t>
             </w:r>
             <w:r>
               <w:rPr>
@@ -2360,7 +2359,7 @@
               <w14:numForm w14:val="default"/>
             </w:rPr>
           </w:pPr>
-          <w:hyperlink w:anchor="_Toc224309161" w:history="1">
+          <w:hyperlink w:anchor="_Toc224314105" w:history="1">
             <w:r>
               <w:rPr>
                 <w:rStyle w:val="Hypertextovodkaz"/>
@@ -2387,7 +2386,7 @@
                 <w:noProof/>
                 <w:webHidden/>
               </w:rPr>
-              <w:instrText xml:space="preserve"> PAGEREF _Toc224309161 \h </w:instrText>
+              <w:instrText xml:space="preserve"> PAGEREF _Toc224314105 \h </w:instrText>
             </w:r>
             <w:r>
               <w:rPr>
@@ -2407,7 +2406,7 @@
                 <w:noProof/>
                 <w:webHidden/>
               </w:rPr>
-              <w:t>22</w:t>
+              <w:t>23</w:t>
             </w:r>
             <w:r>
               <w:rPr>
@@ -2435,7 +2434,7 @@
               <w14:numForm w14:val="default"/>
             </w:rPr>
           </w:pPr>
-          <w:hyperlink w:anchor="_Toc224309162" w:history="1">
+          <w:hyperlink w:anchor="_Toc224314106" w:history="1">
             <w:r>
               <w:rPr>
                 <w:rStyle w:val="Hypertextovodkaz"/>
@@ -2462,7 +2461,7 @@
                 <w:noProof/>
                 <w:webHidden/>
               </w:rPr>
-              <w:instrText xml:space="preserve"> PAGEREF _Toc224309162 \h </w:instrText>
+              <w:instrText xml:space="preserve"> PAGEREF _Toc224314106 \h </w:instrText>
             </w:r>
             <w:r>
               <w:rPr>
@@ -2482,7 +2481,7 @@
                 <w:noProof/>
                 <w:webHidden/>
               </w:rPr>
-              <w:t>22</w:t>
+              <w:t>23</w:t>
             </w:r>
             <w:r>
               <w:rPr>
@@ -2510,7 +2509,7 @@
               <w14:numForm w14:val="default"/>
             </w:rPr>
           </w:pPr>
-          <w:hyperlink w:anchor="_Toc224309163" w:history="1">
+          <w:hyperlink w:anchor="_Toc224314107" w:history="1">
             <w:r>
               <w:rPr>
                 <w:rStyle w:val="Hypertextovodkaz"/>
@@ -2537,7 +2536,7 @@
                 <w:noProof/>
                 <w:webHidden/>
               </w:rPr>
-              <w:instrText xml:space="preserve"> PAGEREF _Toc224309163 \h </w:instrText>
+              <w:instrText xml:space="preserve"> PAGEREF _Toc224314107 \h </w:instrText>
             </w:r>
             <w:r>
               <w:rPr>
@@ -2557,7 +2556,7 @@
                 <w:noProof/>
                 <w:webHidden/>
               </w:rPr>
-              <w:t>22</w:t>
+              <w:t>23</w:t>
             </w:r>
             <w:r>
               <w:rPr>
@@ -2585,7 +2584,7 @@
               <w14:numForm w14:val="default"/>
             </w:rPr>
           </w:pPr>
-          <w:hyperlink w:anchor="_Toc224309164" w:history="1">
+          <w:hyperlink w:anchor="_Toc224314108" w:history="1">
             <w:r>
               <w:rPr>
                 <w:rStyle w:val="Hypertextovodkaz"/>
@@ -2612,7 +2611,7 @@
                 <w:noProof/>
                 <w:webHidden/>
               </w:rPr>
-              <w:instrText xml:space="preserve"> PAGEREF _Toc224309164 \h </w:instrText>
+              <w:instrText xml:space="preserve"> PAGEREF _Toc224314108 \h </w:instrText>
             </w:r>
             <w:r>
               <w:rPr>
@@ -2632,7 +2631,7 @@
                 <w:noProof/>
                 <w:webHidden/>
               </w:rPr>
-              <w:t>23</w:t>
+              <w:t>24</w:t>
             </w:r>
             <w:r>
               <w:rPr>
@@ -2660,7 +2659,7 @@
               <w14:numForm w14:val="default"/>
             </w:rPr>
           </w:pPr>
-          <w:hyperlink w:anchor="_Toc224309165" w:history="1">
+          <w:hyperlink w:anchor="_Toc224314109" w:history="1">
             <w:r>
               <w:rPr>
                 <w:rStyle w:val="Hypertextovodkaz"/>
@@ -2687,7 +2686,7 @@
                 <w:noProof/>
                 <w:webHidden/>
               </w:rPr>
-              <w:instrText xml:space="preserve"> PAGEREF _Toc224309165 \h </w:instrText>
+              <w:instrText xml:space="preserve"> PAGEREF _Toc224314109 \h </w:instrText>
             </w:r>
             <w:r>
               <w:rPr>
@@ -2707,7 +2706,7 @@
                 <w:noProof/>
                 <w:webHidden/>
               </w:rPr>
-              <w:t>23</w:t>
+              <w:t>24</w:t>
             </w:r>
             <w:r>
               <w:rPr>
@@ -2735,7 +2734,7 @@
               <w14:numForm w14:val="default"/>
             </w:rPr>
           </w:pPr>
-          <w:hyperlink w:anchor="_Toc224309166" w:history="1">
+          <w:hyperlink w:anchor="_Toc224314110" w:history="1">
             <w:r>
               <w:rPr>
                 <w:rStyle w:val="Hypertextovodkaz"/>
@@ -2762,7 +2761,7 @@
                 <w:noProof/>
                 <w:webHidden/>
               </w:rPr>
-              <w:instrText xml:space="preserve"> PAGEREF _Toc224309166 \h </w:instrText>
+              <w:instrText xml:space="preserve"> PAGEREF _Toc224314110 \h </w:instrText>
             </w:r>
             <w:r>
               <w:rPr>
@@ -2782,7 +2781,7 @@
                 <w:noProof/>
                 <w:webHidden/>
               </w:rPr>
-              <w:t>23</w:t>
+              <w:t>24</w:t>
             </w:r>
             <w:r>
               <w:rPr>
@@ -2810,7 +2809,7 @@
               <w14:numForm w14:val="default"/>
             </w:rPr>
           </w:pPr>
-          <w:hyperlink w:anchor="_Toc224309167" w:history="1">
+          <w:hyperlink w:anchor="_Toc224314111" w:history="1">
             <w:r>
               <w:rPr>
                 <w:rStyle w:val="Hypertextovodkaz"/>
@@ -2837,7 +2836,7 @@
                 <w:noProof/>
                 <w:webHidden/>
               </w:rPr>
-              <w:instrText xml:space="preserve"> PAGEREF _Toc224309167 \h </w:instrText>
+              <w:instrText xml:space="preserve"> PAGEREF _Toc224314111 \h </w:instrText>
             </w:r>
             <w:r>
               <w:rPr>
@@ -2857,7 +2856,7 @@
                 <w:noProof/>
                 <w:webHidden/>
               </w:rPr>
-              <w:t>23</w:t>
+              <w:t>24</w:t>
             </w:r>
             <w:r>
               <w:rPr>
@@ -2885,7 +2884,7 @@
               <w14:numForm w14:val="default"/>
             </w:rPr>
           </w:pPr>
-          <w:hyperlink w:anchor="_Toc224309168" w:history="1">
+          <w:hyperlink w:anchor="_Toc224314112" w:history="1">
             <w:r>
               <w:rPr>
                 <w:rStyle w:val="Hypertextovodkaz"/>
@@ -2912,7 +2911,7 @@
                 <w:noProof/>
                 <w:webHidden/>
               </w:rPr>
-              <w:instrText xml:space="preserve"> PAGEREF _Toc224309168 \h </w:instrText>
+              <w:instrText xml:space="preserve"> PAGEREF _Toc224314112 \h </w:instrText>
             </w:r>
             <w:r>
               <w:rPr>
@@ -2932,7 +2931,7 @@
                 <w:noProof/>
                 <w:webHidden/>
               </w:rPr>
-              <w:t>23</w:t>
+              <w:t>24</w:t>
             </w:r>
             <w:r>
               <w:rPr>
@@ -2960,7 +2959,7 @@
               <w14:numForm w14:val="default"/>
             </w:rPr>
           </w:pPr>
-          <w:hyperlink w:anchor="_Toc224309169" w:history="1">
+          <w:hyperlink w:anchor="_Toc224314113" w:history="1">
             <w:r>
               <w:rPr>
                 <w:rStyle w:val="Hypertextovodkaz"/>
@@ -2987,7 +2986,7 @@
                 <w:noProof/>
                 <w:webHidden/>
               </w:rPr>
-              <w:instrText xml:space="preserve"> PAGEREF _Toc224309169 \h </w:instrText>
+              <w:instrText xml:space="preserve"> PAGEREF _Toc224314113 \h </w:instrText>
             </w:r>
             <w:r>
               <w:rPr>
@@ -3007,7 +3006,7 @@
                 <w:noProof/>
                 <w:webHidden/>
               </w:rPr>
-              <w:t>24</w:t>
+              <w:t>25</w:t>
             </w:r>
             <w:r>
               <w:rPr>
@@ -3035,7 +3034,7 @@
               <w14:numForm w14:val="default"/>
             </w:rPr>
           </w:pPr>
-          <w:hyperlink w:anchor="_Toc224309170" w:history="1">
+          <w:hyperlink w:anchor="_Toc224314114" w:history="1">
             <w:r>
               <w:rPr>
                 <w:rStyle w:val="Hypertextovodkaz"/>
@@ -3062,7 +3061,7 @@
                 <w:noProof/>
                 <w:webHidden/>
               </w:rPr>
-              <w:instrText xml:space="preserve"> PAGEREF _Toc224309170 \h </w:instrText>
+              <w:instrText xml:space="preserve"> PAGEREF _Toc224314114 \h </w:instrText>
             </w:r>
             <w:r>
               <w:rPr>
@@ -3082,7 +3081,7 @@
                 <w:noProof/>
                 <w:webHidden/>
               </w:rPr>
-              <w:t>25</w:t>
+              <w:t>26</w:t>
             </w:r>
             <w:r>
               <w:rPr>
@@ -3110,7 +3109,7 @@
               <w14:numForm w14:val="default"/>
             </w:rPr>
           </w:pPr>
-          <w:hyperlink w:anchor="_Toc224309171" w:history="1">
+          <w:hyperlink w:anchor="_Toc224314115" w:history="1">
             <w:r>
               <w:rPr>
                 <w:rStyle w:val="Hypertextovodkaz"/>
@@ -3137,7 +3136,7 @@
                 <w:noProof/>
                 <w:webHidden/>
               </w:rPr>
-              <w:instrText xml:space="preserve"> PAGEREF _Toc224309171 \h </w:instrText>
+              <w:instrText xml:space="preserve"> PAGEREF _Toc224314115 \h </w:instrText>
             </w:r>
             <w:r>
               <w:rPr>
@@ -3157,7 +3156,7 @@
                 <w:noProof/>
                 <w:webHidden/>
               </w:rPr>
-              <w:t>26</w:t>
+              <w:t>27</w:t>
             </w:r>
             <w:r>
               <w:rPr>
@@ -3185,7 +3184,7 @@
               <w14:numForm w14:val="default"/>
             </w:rPr>
           </w:pPr>
-          <w:hyperlink w:anchor="_Toc224309172" w:history="1">
+          <w:hyperlink w:anchor="_Toc224314116" w:history="1">
             <w:r>
               <w:rPr>
                 <w:rStyle w:val="Hypertextovodkaz"/>
@@ -3212,7 +3211,7 @@
                 <w:noProof/>
                 <w:webHidden/>
               </w:rPr>
-              <w:instrText xml:space="preserve"> PAGEREF _Toc224309172 \h </w:instrText>
+              <w:instrText xml:space="preserve"> PAGEREF _Toc224314116 \h </w:instrText>
             </w:r>
             <w:r>
               <w:rPr>
@@ -3413,7 +3412,7 @@
       <w:pPr>
         <w:pStyle w:val="Nadpis1neslovan"/>
       </w:pPr>
-      <w:bookmarkStart w:id="0" w:name="_Toc224309138"/>
+      <w:bookmarkStart w:id="0" w:name="_Toc224314082"/>
       <w:r>
         <w:lastRenderedPageBreak/>
         <w:t>Introduction</w:t>
@@ -3499,7 +3498,7 @@
       <w:pPr>
         <w:pStyle w:val="Nadpis1"/>
       </w:pPr>
-      <w:bookmarkStart w:id="1" w:name="_Toc224309139"/>
+      <w:bookmarkStart w:id="1" w:name="_Toc224314083"/>
       <w:r>
         <w:lastRenderedPageBreak/>
         <w:t>Observability</w:t>
@@ -3510,7 +3509,7 @@
       <w:pPr>
         <w:pStyle w:val="Nadpis2"/>
       </w:pPr>
-      <w:bookmarkStart w:id="2" w:name="_Toc224309140"/>
+      <w:bookmarkStart w:id="2" w:name="_Toc224314084"/>
       <w:r>
         <w:t>Definition</w:t>
       </w:r>
@@ -3664,7 +3663,7 @@
       <w:pPr>
         <w:pStyle w:val="Nadpis2"/>
       </w:pPr>
-      <w:bookmarkStart w:id="3" w:name="_Toc224309141"/>
+      <w:bookmarkStart w:id="3" w:name="_Toc224314085"/>
       <w:r>
         <w:t>Costs and Benefits</w:t>
       </w:r>
@@ -3815,7 +3814,7 @@
       <w:pPr>
         <w:pStyle w:val="Nadpis3"/>
       </w:pPr>
-      <w:bookmarkStart w:id="4" w:name="_Toc224309142"/>
+      <w:bookmarkStart w:id="4" w:name="_Toc224314086"/>
       <w:r>
         <w:t>S</w:t>
       </w:r>
@@ -3959,7 +3958,7 @@
       <w:pPr>
         <w:pStyle w:val="Nadpis2"/>
       </w:pPr>
-      <w:bookmarkStart w:id="5" w:name="_Toc224309143"/>
+      <w:bookmarkStart w:id="5" w:name="_Toc224314087"/>
       <w:r>
         <w:t>Outages</w:t>
       </w:r>
@@ -4031,7 +4030,7 @@
       <w:pPr>
         <w:pStyle w:val="Nadpis3"/>
       </w:pPr>
-      <w:bookmarkStart w:id="6" w:name="_Toc224309144"/>
+      <w:bookmarkStart w:id="6" w:name="_Toc224314088"/>
       <w:r>
         <w:t>Knight Capital</w:t>
       </w:r>
@@ -4213,18 +4212,183 @@
     <w:p>
       <w:pPr>
         <w:pStyle w:val="Nadpis3"/>
-        <w:rPr>
-          <w:highlight w:val="yellow"/>
-        </w:rPr>
-      </w:pPr>
-      <w:bookmarkStart w:id="7" w:name="_Toc224309145"/>
-      <w:r>
-        <w:rPr>
-          <w:highlight w:val="yellow"/>
-        </w:rPr>
+      </w:pPr>
+      <w:bookmarkStart w:id="7" w:name="_Toc224314089"/>
+      <w:r>
         <w:t>CrowdStrike Outage</w:t>
       </w:r>
       <w:bookmarkEnd w:id="7"/>
+    </w:p>
+    <w:p>
+      <w:r>
+        <w:t xml:space="preserve">On July 19, 2024, a faulty software update by a cybersecurity giant CrowdStrike resulted in a global outage of 8.5 million Windows </w:t>
+      </w:r>
+      <w:r>
+        <w:t>devices,</w:t>
+      </w:r>
+      <w:r>
+        <w:t xml:space="preserve"> causing major disruptions across critical infrastructure. Over 75% of Fortune 500 companies were affected and estimated losses of this event approach $100 billion dollars</w:t>
+      </w:r>
+      <w:r>
+        <w:t>.</w:t>
+      </w:r>
+    </w:p>
+    <w:p>
+      <w:r>
+        <w:t>The economic impact was widespread – 6500 flights had been grounded at peak, New York Stock Exchange lost the ability to execute trades for nearly 3 hours, healthcare administrators reported average downtime of 4 hours in critical surgery units, governments averaged 2-6 hours of downtime for critical digital services. The crisis caused by this update lasted for two days after the update was deployed</w:t>
+      </w:r>
+      <w:r>
+        <w:t xml:space="preserve">, as all affected devices had to be manually accessed by the system administrators and the configuration file had to be located and deleted </w:t>
+      </w:r>
+      <w:r>
+        <w:t>(Dr. A.</w:t>
+      </w:r>
+      <w:r>
+        <w:t xml:space="preserve"> </w:t>
+      </w:r>
+      <w:r>
+        <w:t>Shaji George, 2024)</w:t>
+      </w:r>
+      <w:r>
+        <w:t>.</w:t>
+      </w:r>
+    </w:p>
+    <w:p>
+      <w:r>
+        <w:t xml:space="preserve">This crash was caused by an incorrect regex (regular expression) wildcard search, which was expected to load </w:t>
+      </w:r>
+      <w:r>
+        <w:t>21 elements into the program from a configuration</w:t>
+      </w:r>
+      <w:r>
+        <w:t>. However,</w:t>
+      </w:r>
+      <w:r>
+        <w:t xml:space="preserve"> the configuration </w:t>
+      </w:r>
+      <w:r>
+        <w:t>provided to the program</w:t>
+      </w:r>
+      <w:r>
+        <w:t xml:space="preserve"> was incorrect and one of the elements expected was missing. This meant that</w:t>
+      </w:r>
+      <w:r>
+        <w:t xml:space="preserve"> the regex expression </w:t>
+      </w:r>
+      <w:r>
+        <w:t xml:space="preserve">was able to only </w:t>
+      </w:r>
+      <w:r>
+        <w:t xml:space="preserve">find 20 elements. Upon attempting to load the expected twenty first element in the configuration, the program performed an out-of-bounds access, leading to a system crash </w:t>
+      </w:r>
+      <w:r>
+        <w:t>(CrowdStrike Holdings, Inc., 2024)</w:t>
+      </w:r>
+      <w:r>
+        <w:t xml:space="preserve">. </w:t>
+      </w:r>
+      <w:r>
+        <w:t xml:space="preserve"> </w:t>
+      </w:r>
+    </w:p>
+    <w:p>
+      <w:r>
+        <w:t>CrowdStrike has been heavily criticized for its insufficient testing process and the weak, fragile deployment process</w:t>
+      </w:r>
+      <w:r>
+        <w:t xml:space="preserve">. It has been recommended for CrowdStrike to adopt sandboxed rollouts, meaning the software is not released immediately for all customers, instead being initially released for small, contained test groups. </w:t>
+      </w:r>
+      <w:r>
+        <w:t>(Dr. A.</w:t>
+      </w:r>
+      <w:r>
+        <w:t xml:space="preserve"> </w:t>
+      </w:r>
+      <w:r>
+        <w:t>Shaji George, 2024)</w:t>
+      </w:r>
+      <w:r>
+        <w:t>.</w:t>
+      </w:r>
+    </w:p>
+    <w:p>
+      <w:r>
+        <w:t xml:space="preserve">There is much to be learned from these outages, which were entirely preventable, had corners not been cut and deployment, monitoring and alerting systems been sufficiently set up and invested in. </w:t>
+      </w:r>
+    </w:p>
+    <w:p>
+      <w:pPr>
+        <w:pStyle w:val="Nadpis1"/>
+      </w:pPr>
+      <w:bookmarkStart w:id="8" w:name="_Toc224314090"/>
+      <w:r>
+        <w:lastRenderedPageBreak/>
+        <w:t>Monitoring</w:t>
+      </w:r>
+      <w:bookmarkEnd w:id="8"/>
+    </w:p>
+    <w:p>
+      <w:pPr>
+        <w:pStyle w:val="Nadpis2"/>
+      </w:pPr>
+      <w:bookmarkStart w:id="9" w:name="_Toc224314091"/>
+      <w:r>
+        <w:t>Monitoring</w:t>
+      </w:r>
+      <w:bookmarkEnd w:id="9"/>
+    </w:p>
+    <w:p>
+      <w:pPr>
+        <w:pStyle w:val="Nadpis3"/>
+      </w:pPr>
+      <w:bookmarkStart w:id="10" w:name="_Toc224314092"/>
+      <w:r>
+        <w:t>Real-time monitoring</w:t>
+      </w:r>
+      <w:bookmarkEnd w:id="10"/>
+    </w:p>
+    <w:p>
+      <w:pPr>
+        <w:pStyle w:val="Nadpis3"/>
+      </w:pPr>
+      <w:bookmarkStart w:id="11" w:name="_Toc224314093"/>
+      <w:r>
+        <w:t>Dashboards and Single Pane of Glass</w:t>
+      </w:r>
+      <w:bookmarkEnd w:id="11"/>
+    </w:p>
+    <w:p>
+      <w:pPr>
+        <w:pStyle w:val="Nadpis2"/>
+      </w:pPr>
+      <w:bookmarkStart w:id="12" w:name="_Toc224314094"/>
+      <w:r>
+        <w:t>Alerting</w:t>
+      </w:r>
+      <w:bookmarkEnd w:id="12"/>
+    </w:p>
+    <w:p>
+      <w:pPr>
+        <w:pStyle w:val="Nadpis3"/>
+      </w:pPr>
+      <w:bookmarkStart w:id="13" w:name="_Toc224314095"/>
+      <w:r>
+        <w:t>Methods of Alerting</w:t>
+      </w:r>
+      <w:bookmarkEnd w:id="13"/>
+    </w:p>
+    <w:p>
+      <w:pPr>
+        <w:pStyle w:val="Nadpis3"/>
+      </w:pPr>
+      <w:r>
+        <w:tab/>
+      </w:r>
+      <w:bookmarkStart w:id="14" w:name="_Toc224314096"/>
+      <w:r>
+        <w:t>Alert Fatigue</w:t>
+      </w:r>
+      <w:bookmarkEnd w:id="14"/>
     </w:p>
     <w:p>
       <w:pPr>
@@ -4236,87 +4400,7 @@
       <w:pPr>
         <w:pStyle w:val="Nadpis1"/>
       </w:pPr>
-      <w:bookmarkStart w:id="8" w:name="_Toc224309146"/>
-      <w:r>
-        <w:lastRenderedPageBreak/>
-        <w:t>Monitoring</w:t>
-      </w:r>
-      <w:bookmarkEnd w:id="8"/>
-    </w:p>
-    <w:p>
-      <w:pPr>
-        <w:pStyle w:val="Nadpis2"/>
-      </w:pPr>
-      <w:bookmarkStart w:id="9" w:name="_Toc224309147"/>
-      <w:r>
-        <w:t>Monitoring</w:t>
-      </w:r>
-      <w:bookmarkEnd w:id="9"/>
-    </w:p>
-    <w:p>
-      <w:pPr>
-        <w:pStyle w:val="Nadpis3"/>
-      </w:pPr>
-      <w:bookmarkStart w:id="10" w:name="_Toc224309148"/>
-      <w:r>
-        <w:t>Real-time monitoring</w:t>
-      </w:r>
-      <w:bookmarkEnd w:id="10"/>
-    </w:p>
-    <w:p>
-      <w:pPr>
-        <w:pStyle w:val="Nadpis3"/>
-      </w:pPr>
-      <w:bookmarkStart w:id="11" w:name="_Toc224309149"/>
-      <w:r>
-        <w:t>Dashboards and Single Pane of Glass</w:t>
-      </w:r>
-      <w:bookmarkEnd w:id="11"/>
-    </w:p>
-    <w:p>
-      <w:pPr>
-        <w:pStyle w:val="Nadpis2"/>
-      </w:pPr>
-      <w:bookmarkStart w:id="12" w:name="_Toc224309150"/>
-      <w:r>
-        <w:t>Alerting</w:t>
-      </w:r>
-      <w:bookmarkEnd w:id="12"/>
-    </w:p>
-    <w:p>
-      <w:pPr>
-        <w:pStyle w:val="Nadpis3"/>
-      </w:pPr>
-      <w:bookmarkStart w:id="13" w:name="_Toc224309151"/>
-      <w:r>
-        <w:t>Methods of Alerting</w:t>
-      </w:r>
-      <w:bookmarkEnd w:id="13"/>
-    </w:p>
-    <w:p>
-      <w:pPr>
-        <w:pStyle w:val="Nadpis3"/>
-      </w:pPr>
-      <w:r>
-        <w:tab/>
-      </w:r>
-      <w:bookmarkStart w:id="14" w:name="_Toc224309152"/>
-      <w:r>
-        <w:t>Alert Fatigue</w:t>
-      </w:r>
-      <w:bookmarkEnd w:id="14"/>
-    </w:p>
-    <w:p>
-      <w:pPr>
-        <w:spacing w:after="160" w:line="259" w:lineRule="auto"/>
-        <w:jc w:val="left"/>
-      </w:pPr>
-    </w:p>
-    <w:p>
-      <w:pPr>
-        <w:pStyle w:val="Nadpis1"/>
-      </w:pPr>
-      <w:bookmarkStart w:id="15" w:name="_Toc224309153"/>
+      <w:bookmarkStart w:id="15" w:name="_Toc224314097"/>
       <w:r>
         <w:lastRenderedPageBreak/>
         <w:t>Logging</w:t>
@@ -4495,7 +4579,7 @@
       <w:pPr>
         <w:pStyle w:val="Nadpis2"/>
       </w:pPr>
-      <w:bookmarkStart w:id="16" w:name="_Toc224309154"/>
+      <w:bookmarkStart w:id="16" w:name="_Toc224314098"/>
       <w:r>
         <w:t>Logging Formats</w:t>
       </w:r>
@@ -4540,7 +4624,7 @@
       <w:pPr>
         <w:pStyle w:val="Nadpis3"/>
       </w:pPr>
-      <w:bookmarkStart w:id="17" w:name="_Toc224309155"/>
+      <w:bookmarkStart w:id="17" w:name="_Toc224314099"/>
       <w:r>
         <w:t>JSON</w:t>
       </w:r>
@@ -5144,7 +5228,7 @@
       <w:pPr>
         <w:pStyle w:val="Nadpis3"/>
       </w:pPr>
-      <w:bookmarkStart w:id="20" w:name="_Toc224309156"/>
+      <w:bookmarkStart w:id="20" w:name="_Toc224314100"/>
       <w:r>
         <w:t>X</w:t>
       </w:r>
@@ -5928,7 +6012,7 @@
       <w:pPr>
         <w:pStyle w:val="Nadpis3"/>
       </w:pPr>
-      <w:bookmarkStart w:id="21" w:name="_Toc224309157"/>
+      <w:bookmarkStart w:id="21" w:name="_Toc224314101"/>
       <w:r>
         <w:t>S</w:t>
       </w:r>
@@ -8162,7 +8246,7 @@
           <w:highlight w:val="yellow"/>
         </w:rPr>
       </w:pPr>
-      <w:bookmarkStart w:id="22" w:name="_Toc224309158"/>
+      <w:bookmarkStart w:id="22" w:name="_Toc224314102"/>
       <w:r>
         <w:rPr>
           <w:highlight w:val="yellow"/>
@@ -8176,7 +8260,7 @@
       <w:pPr>
         <w:pStyle w:val="Nadpis2"/>
       </w:pPr>
-      <w:bookmarkStart w:id="23" w:name="_Toc224309159"/>
+      <w:bookmarkStart w:id="23" w:name="_Toc224314103"/>
       <w:r>
         <w:t>Creating logs</w:t>
       </w:r>
@@ -9215,7 +9299,7 @@
       <w:pPr>
         <w:pStyle w:val="Nadpis2"/>
       </w:pPr>
-      <w:bookmarkStart w:id="24" w:name="_Toc224309160"/>
+      <w:bookmarkStart w:id="24" w:name="_Toc224314104"/>
       <w:r>
         <w:t>Storing</w:t>
       </w:r>
@@ -9280,7 +9364,7 @@
       <w:pPr>
         <w:pStyle w:val="Nadpis2"/>
       </w:pPr>
-      <w:bookmarkStart w:id="25" w:name="_Toc224309161"/>
+      <w:bookmarkStart w:id="25" w:name="_Toc224314105"/>
       <w:r>
         <w:t>Analyzing logs</w:t>
       </w:r>
@@ -9292,7 +9376,7 @@
       <w:pPr>
         <w:pStyle w:val="Nadpis3"/>
       </w:pPr>
-      <w:bookmarkStart w:id="26" w:name="_Toc224309162"/>
+      <w:bookmarkStart w:id="26" w:name="_Toc224314106"/>
       <w:r>
         <w:t>System Logs</w:t>
       </w:r>
@@ -9302,7 +9386,7 @@
       <w:pPr>
         <w:pStyle w:val="Nadpis3"/>
       </w:pPr>
-      <w:bookmarkStart w:id="27" w:name="_Toc224309163"/>
+      <w:bookmarkStart w:id="27" w:name="_Toc224314107"/>
       <w:r>
         <w:t>Storage requirements and costs</w:t>
       </w:r>
@@ -9312,7 +9396,7 @@
       <w:pPr>
         <w:pStyle w:val="Nadpis1"/>
       </w:pPr>
-      <w:bookmarkStart w:id="28" w:name="_Toc224309164"/>
+      <w:bookmarkStart w:id="28" w:name="_Toc224314108"/>
       <w:r>
         <w:lastRenderedPageBreak/>
         <w:t>Application</w:t>
@@ -9326,7 +9410,7 @@
       <w:pPr>
         <w:pStyle w:val="Nadpis2"/>
       </w:pPr>
-      <w:bookmarkStart w:id="29" w:name="_Toc224309165"/>
+      <w:bookmarkStart w:id="29" w:name="_Toc224314109"/>
       <w:r>
         <w:t>Requirements</w:t>
       </w:r>
@@ -9336,7 +9420,7 @@
       <w:pPr>
         <w:pStyle w:val="Nadpis2"/>
       </w:pPr>
-      <w:bookmarkStart w:id="30" w:name="_Toc224309166"/>
+      <w:bookmarkStart w:id="30" w:name="_Toc224314110"/>
       <w:r>
         <w:t>Specification</w:t>
       </w:r>
@@ -9346,7 +9430,7 @@
       <w:pPr>
         <w:pStyle w:val="Nadpis2"/>
       </w:pPr>
-      <w:bookmarkStart w:id="31" w:name="_Toc224309167"/>
+      <w:bookmarkStart w:id="31" w:name="_Toc224314111"/>
       <w:r>
         <w:t>Implementation</w:t>
       </w:r>
@@ -9356,7 +9440,7 @@
       <w:pPr>
         <w:pStyle w:val="Nadpis2"/>
       </w:pPr>
-      <w:bookmarkStart w:id="32" w:name="_Toc224309168"/>
+      <w:bookmarkStart w:id="32" w:name="_Toc224314112"/>
       <w:r>
         <w:t>Testing and CI/CD</w:t>
       </w:r>
@@ -9366,7 +9450,7 @@
       <w:pPr>
         <w:pStyle w:val="Nadpis1"/>
       </w:pPr>
-      <w:bookmarkStart w:id="33" w:name="_Toc224309169"/>
+      <w:bookmarkStart w:id="33" w:name="_Toc224314113"/>
       <w:r>
         <w:lastRenderedPageBreak/>
         <w:t>Discussion to implementation</w:t>
@@ -9377,7 +9461,7 @@
       <w:pPr>
         <w:pStyle w:val="Nadpis1"/>
       </w:pPr>
-      <w:bookmarkStart w:id="34" w:name="_Toc224309170"/>
+      <w:bookmarkStart w:id="34" w:name="_Toc224314114"/>
       <w:r>
         <w:lastRenderedPageBreak/>
         <w:t>Conclusions</w:t>
@@ -9388,7 +9472,7 @@
       <w:pPr>
         <w:pStyle w:val="Nadpis1"/>
       </w:pPr>
-      <w:bookmarkStart w:id="35" w:name="_Toc224309171"/>
+      <w:bookmarkStart w:id="35" w:name="_Toc224314115"/>
       <w:r>
         <w:lastRenderedPageBreak/>
         <w:t>List of references</w:t>
@@ -9547,7 +9631,7 @@
       <w:pPr>
         <w:pStyle w:val="Nadpis1neslovan"/>
       </w:pPr>
-      <w:bookmarkStart w:id="36" w:name="_Toc224309172"/>
+      <w:bookmarkStart w:id="36" w:name="_Toc224314116"/>
       <w:r>
         <w:lastRenderedPageBreak/>
         <w:t>Appendices</w:t>

</xml_diff>